<commit_message>
Name the team as Group 1 on the report cover
The title page now reads "by Group 1", and the PDF cover's team heading
says "Submitted by Group 1". PDF and Word files rebuilt.
</commit_message>
<xml_diff>
--- a/reports/StoreSense_DMDW_Project_Report.docx
+++ b/reports/StoreSense_DMDW_Project_Report.docx
@@ -99,6 +99,16 @@
       </w:pPr>
       <w:r>
         <w:t xml:space="preserve">by</w:t>
+      </w:r>
+      <w:r>
+        <w:t xml:space="preserve"> </w:t>
+      </w:r>
+      <w:r>
+        <w:rPr>
+          <w:b/>
+          <w:bCs/>
+        </w:rPr>
+        <w:t xml:space="preserve">Group 1</w:t>
       </w:r>
     </w:p>
     <w:tbl>

</xml_diff>